<commit_message>
Drop the ethics approval date from the title page and declarations
The reference number stays; the date is not needed per the authors.

Co-Authored-By: Claude Sonnet 5.5 <noreply@anthropic.com>
Claude-Session: https://claude.ai/code/session_013TkounLTBFVQRstE3VnhkM
</commit_message>
<xml_diff>
--- a/EJR_投稿操作单.docx
+++ b/EJR_投稿操作单.docx
@@ -79,16 +79,7 @@
         <w:spacing w:after="160"/>
       </w:pPr>
       <w:r>
-        <w:t>• 标题页：题目、全体作者姓名（名在前姓在后）、用小写上标字母 a、b 对应的单位（含完整通信地址和国家）、通讯作者的完整地址和邮箱、致谢 ✓。伦理批准</w:t>
-      </w:r>
-      <w:r>
-        <w:rPr>
-          <w:b/>
-        </w:rPr>
-        <w:t>日期还缺，见第五节</w:t>
-      </w:r>
-      <w:r>
-        <w:t xml:space="preserve"> ✗</w:t>
+        <w:t>• 标题页：题目、全体作者姓名（名在前姓在后）、用小写上标字母 a、b 对应的单位（含完整通信地址和国家）、通讯作者的完整地址和邮箱、致谢 ✓</w:t>
       </w:r>
     </w:p>
     <w:p>
@@ -177,7 +168,7 @@
         <w:spacing w:after="160"/>
       </w:pPr>
       <w:r>
-        <w:t>• 伦理（须知第 8–9 页）：人体研究要写明伦理批准、遵循的准则、知情同意情况，并含批准日期和编号。完整声明在标题页，匿名正文和 Declarations 文件里只写批准和豁免知情同意 ✓（日期待填）</w:t>
+        <w:t>• 伦理（须知第 8–9 页）：人体研究要写明伦理批准、遵循的准则、知情同意情况，须知还写“声明应含批准日期和编号”。按你的决定，声明里只写编号 2026R018-E01、不写批准日期。完整声明在标题页，匿名正文和 Declarations 文件里只写批准和豁免知情同意 ✓</w:t>
       </w:r>
     </w:p>
     <w:p>
@@ -399,9 +390,6 @@
           <w:rFonts w:ascii="Courier New" w:hAnsi="Courier New"/>
         </w:rPr>
         <w:t>EJR_2_TitlePage.docx</w:t>
-      </w:r>
-      <w:r>
-        <w:t>（先把里面的 [APPROVAL DATE] 换成伦理批准日期，见第五节）</w:t>
       </w:r>
     </w:p>
     <w:p>
@@ -893,21 +881,7 @@
         <w:rPr>
           <w:b/>
         </w:rPr>
-        <w:t>1. 伦理批准日期。</w:t>
-      </w:r>
-      <w:r>
-        <w:t xml:space="preserve"> EJR 须知要求伦理声明含批准日期和编号。标题页里写的是 [APPROVAL DATE]，请把批准日期发给我，或者上传前自己在标题页里改（编号 2026R018-E01 已写）。</w:t>
-      </w:r>
-    </w:p>
-    <w:p>
-      <w:pPr>
-        <w:spacing w:after="160"/>
-      </w:pPr>
-      <w:r>
-        <w:rPr>
-          <w:b/>
-        </w:rPr>
-        <w:t>2. CRediT 角色分配。</w:t>
+        <w:t>1. CRediT 角色分配。</w:t>
       </w:r>
       <w:r>
         <w:t xml:space="preserve"> 我按你们原来的贡献说明对应成 CRediT 角色：Jun Shu 与 Jun Yang 的构思和设计对应 Conceptualization、Methodology；数据采集对应 Investigation 和 Data curation；复核锚定手术、检查时间和盲法裁定对应 Validation；分析由 Jun Shu 和 Hongqiang Bian 做（Formal analysis）；起草 Jun Shu（Writing – original draft）；全体作者审稿修改（Writing – review &amp; editing）；Jun Yang 指导（Supervision）。没有写 Software、Visualization、Project administration、Resources，因为原说明没提；若有，请告诉我。</w:t>
@@ -921,7 +895,7 @@
         <w:rPr>
           <w:b/>
         </w:rPr>
-        <w:t>3. 致谢里三位同事是否同意。</w:t>
+        <w:t>2. 致谢里三位同事是否同意。</w:t>
       </w:r>
       <w:r>
         <w:t xml:space="preserve"> 标题页致谢点名了 Guanghua Zhang、Hongxi Guo、Haibin Wang，请确认他们同意被列入。</w:t>
@@ -935,7 +909,7 @@
         <w:rPr>
           <w:b/>
         </w:rPr>
-        <w:t>4. 字数口径。</w:t>
+        <w:t>3. 字数口径。</w:t>
       </w:r>
       <w:r>
         <w:t xml:space="preserve"> 须知写“研究论文不超过 4,000 词，含摘要、图例，参考文献最多 40 条”。若参考文献文字也算在内，本稿是：正文 2,977 + 摘要 249 + 图例 247 = 3,473 词；加参考文献 851 词（含 DOI 链接）= 4,324 词，超出约 320 词。若只算前三项则没有超出。我不确定 EJR 怎么算，也没有为此删稿。若你想按最严口径，我可以删约 350 词，但要动正文，需要你同意。</w:t>
@@ -949,7 +923,7 @@
         <w:rPr>
           <w:b/>
         </w:rPr>
-        <w:t>5. 声明文件里的 AI 一句。</w:t>
+        <w:t>4. 声明文件里的 AI 一句。</w:t>
       </w:r>
       <w:r>
         <w:t xml:space="preserve"> “No figure was created or altered with a generative AI tool; the figures were produced by analysis code from the study data.”这一句是我加的，依据是全部图都由 matplotlib 代码出图，请你们确认无误。</w:t>

</xml_diff>

<commit_message>
Operation sheet: the Declarations item is the Elsevier ethical declaration; record the answers
Co-Authored-By: Claude Sonnet 5.5 <noreply@anthropic.com>
Claude-Session: https://claude.ai/code/session_013TkounLTBFVQRstE3VnhkM
</commit_message>
<xml_diff>
--- a/EJR_投稿操作单.docx
+++ b/EJR_投稿操作单.docx
@@ -423,7 +423,7 @@
         <w:t>Declarations</w:t>
       </w:r>
       <w:r>
-        <w:t xml:space="preserve"> → </w:t>
+        <w:t xml:space="preserve"> → 用 Elsevier 伦理声明工具（页面标题 “Confirm your ethical declaration”）生成并下载的 Word 文件。该页面写明 “you must download, review and upload your declaration in Editorial Manager”，所以这个类型大概率就是它。</w:t>
       </w:r>
       <w:r>
         <w:rPr>
@@ -432,7 +432,25 @@
         <w:t>EJR_5_Declarations.docx</w:t>
       </w:r>
       <w:r>
-        <w:t>。这个类型的用途须知里没有说明，我按“声明类内容”准备，内容匿名（伦理、知情同意、资助、数据可用性、AI 声明）。选类型时若页面有说明文字不同，截图给我</w:t>
+        <w:t xml:space="preserve"> 作为备用，工具文件可用时不上传。工具里的答案：涉及对象选 Human（不选 Animal）；“Confirm … complies with relevant laws” 打勾，Guidelines 填 Declaration of Helsinki；伦理委员会选 “Yes, and approved”，编号 2026R018-E01（若问委员会名称和日期：Institutional Review Board of Wuhan Children's Hospital (Wuhan Maternal and Child Healthcare Hospital)，2026 年 2 月 9 日）；临床试验选 No；</w:t>
+      </w:r>
+      <w:r>
+        <w:rPr>
+          <w:b/>
+        </w:rPr>
+        <w:t>参与者书面知情同意选 No</w:t>
+      </w:r>
+      <w:r>
+        <w:t>（本研究豁免了知情同意），说明理由写 “The requirement for informed consent was waived by the institutional review board because of the retrospective, de-identified design; no individual participant data, images or identifiable material are published.”；隐私权那一项打勾；</w:t>
+      </w:r>
+      <w:r>
+        <w:rPr>
+          <w:b/>
+        </w:rPr>
+        <w:t>人体生物材料选 No</w:t>
+      </w:r>
+      <w:r>
+        <w:t>（只用了病历和影像报告文字，没有器官、组织等材料，选 Yes 会生成关于捐献者同意的错误声明）；病例报告选 No。</w:t>
       </w:r>
     </w:p>
     <w:p>

</xml_diff>

<commit_message>
Add a fallback declaration of competing interests listing the ten authors
Co-Authored-By: Claude Sonnet 5.5 <noreply@anthropic.com>
Claude-Session: https://claude.ai/code/session_013TkounLTBFVQRstE3VnhkM
</commit_message>
<xml_diff>
--- a/EJR_投稿操作单.docx
+++ b/EJR_投稿操作单.docx
@@ -374,7 +374,7 @@
         <w:t>Declaration of competing interests</w:t>
       </w:r>
       <w:r>
-        <w:t xml:space="preserve"> → 用 Elsevier declarations tool 生成的 Word 文件。和 JACR 时一样，选 “I have nothing to declare”。作者名单要写全 10 位。JACR 时生成的那份只有 7 位，</w:t>
+        <w:t xml:space="preserve"> → 须知要求用 Elsevier declarations tool 生成 Word 文件，选 “I have nothing to declare”，作者名单写全 10 位。JACR 时生成的那份只有 7 位，</w:t>
       </w:r>
       <w:r>
         <w:rPr>
@@ -383,7 +383,16 @@
         <w:t>不能重用</w:t>
       </w:r>
       <w:r>
-        <w:t>，要重新生成</w:t>
+        <w:t xml:space="preserve">。工具暂时用不了时，用备用文件 </w:t>
+      </w:r>
+      <w:r>
+        <w:rPr>
+          <w:rFonts w:ascii="Courier New" w:hAnsi="Courier New"/>
+        </w:rPr>
+        <w:t>EJR_7_Declaration_of_competing_interests.docx</w:t>
+      </w:r>
+      <w:r>
+        <w:t>（Elsevier 标准的“无利益冲突”句，列了 10 位作者）。这是我按标准句写的，不是工具生成的；10 位作者（含新增的 3 位）都要确认确实没有利益冲突</w:t>
       </w:r>
     </w:p>
     <w:p>

</xml_diff>